<commit_message>
feat(documentación): actualizar guía del proyecto con configuración agregada y diseño de modelos
</commit_message>
<xml_diff>
--- a/guias/Proyecto GYM_Django.docx
+++ b/guias/Proyecto GYM_Django.docx
@@ -4148,84 +4148,8 @@
           <ns0:szCs ns0:val="22"/>
         </ns0:rPr>
       </ns0:pPr>
-      <ns0:r ns0:rsidRPr="003750D9">
-        <ns0:rPr>
-          <ns0:rFonts ns0:asciiTheme="minorHAnsi" ns0:hAnsiTheme="minorHAnsi" ns0:cstheme="minorHAnsi"/>
-          <ns0:b/>
-          <ns0:bCs/>
-          <ns0:color ns0:val="000000" ns0:themeColor="text1"/>
-          <ns0:sz ns0:val="22"/>
-          <ns0:szCs ns0:val="22"/>
-        </ns0:rPr>
-        <ns0:lastRenderedPageBreak/>
-        <ns0:t>Autenticación y Roles:</ns0:t>
-      </ns0:r>
-      <ns0:r ns0:rsidRPr="003750D9">
-        <ns0:rPr>
-          <ns0:rFonts ns0:asciiTheme="minorHAnsi" ns0:hAnsiTheme="minorHAnsi" ns0:cstheme="minorHAnsi"/>
-          <ns0:color ns0:val="000000" ns0:themeColor="text1"/>
-          <ns0:sz ns0:val="22"/>
-          <ns0:szCs ns0:val="22"/>
-        </ns0:rPr>
-        <ns0:t xml:space="preserve"> Configura</ns0:t>
-      </ns0:r>
-      <ns0:r ns0:rsidR="00DD05D0">
-        <ns0:rPr>
-          <ns0:rFonts ns0:asciiTheme="minorHAnsi" ns0:hAnsiTheme="minorHAnsi" ns0:cstheme="minorHAnsi"/>
-          <ns0:color ns0:val="000000" ns0:themeColor="text1"/>
-          <ns0:sz ns0:val="22"/>
-          <ns0:szCs ns0:val="22"/>
-        </ns0:rPr>
-        <ns0:t>r las</ns0:t>
-      </ns0:r>
-      <ns0:r ns0:rsidRPr="003750D9">
-        <ns0:rPr>
-          <ns0:rFonts ns0:asciiTheme="minorHAnsi" ns0:hAnsiTheme="minorHAnsi" ns0:cstheme="minorHAnsi"/>
-          <ns0:color ns0:val="000000" ns0:themeColor="text1"/>
-          <ns0:sz ns0:val="22"/>
-          <ns0:szCs ns0:val="22"/>
-        </ns0:rPr>
-        <ns0:t xml:space="preserve"> vistas separadas o condicionales dependiendo de si el usuario logueado es </ns0:t>
-      </ns0:r>
-      <ns0:r ns0:rsidRPr="003750D9">
-        <ns0:rPr>
-          <ns0:rFonts ns0:asciiTheme="minorHAnsi" ns0:hAnsiTheme="minorHAnsi" ns0:cstheme="minorHAnsi"/>
-          <ns0:b/>
-          <ns0:bCs/>
-          <ns0:color ns0:val="000000" ns0:themeColor="text1"/>
-          <ns0:sz ns0:val="22"/>
-          <ns0:szCs ns0:val="22"/>
-        </ns0:rPr>
-        <ns0:t>Aprendiz</ns0:t>
-      </ns0:r>
-      <ns0:r ns0:rsidRPr="003750D9">
-        <ns0:rPr>
-          <ns0:rFonts ns0:asciiTheme="minorHAnsi" ns0:hAnsiTheme="minorHAnsi" ns0:cstheme="minorHAnsi"/>
-          <ns0:color ns0:val="000000" ns0:themeColor="text1"/>
-          <ns0:sz ns0:val="22"/>
-          <ns0:szCs ns0:val="22"/>
-        </ns0:rPr>
-        <ns0:t xml:space="preserve"> (para ver su rutina asignada y su progreso) o </ns0:t>
-      </ns0:r>
-      <ns0:r ns0:rsidRPr="003750D9">
-        <ns0:rPr>
-          <ns0:rFonts ns0:asciiTheme="minorHAnsi" ns0:hAnsiTheme="minorHAnsi" ns0:cstheme="minorHAnsi"/>
-          <ns0:b/>
-          <ns0:bCs/>
-          <ns0:color ns0:val="000000" ns0:themeColor="text1"/>
-          <ns0:sz ns0:val="22"/>
-          <ns0:szCs ns0:val="22"/>
-        </ns0:rPr>
-        <ns0:t>Instructor/Administrador</ns0:t>
-      </ns0:r>
-      <ns0:r ns0:rsidRPr="003750D9">
-        <ns0:rPr>
-          <ns0:rFonts ns0:asciiTheme="minorHAnsi" ns0:hAnsiTheme="minorHAnsi" ns0:cstheme="minorHAnsi"/>
-          <ns0:color ns0:val="000000" ns0:themeColor="text1"/>
-          <ns0:sz ns0:val="22"/>
-          <ns0:szCs ns0:val="22"/>
-        </ns0:rPr>
-        <ns0:t xml:space="preserve"> (para asignar rutinas, registrar seguimientos y gestionar usuarios).</ns0:t>
+      <ns0:r>
+        <ns0:t>Autenticación y roles: ProyectoDjango ya cuenta con registro, inicio y cierre de sesión usando el usuario estándar de Django, y exige iniciar sesión para consultar artículos, categorías y páginas. La creación de roles y permisos propios para Aprendiz, Instructor y Administrador, así como las vistas diferenciadas para cada rol, siguen pendientes.</ns0:t>
       </ns0:r>
     </ns0:p>
     <ns0:p ns2:paraId="2F641980" ns2:textId="533B9965" ns0:rsidR="003750D9" ns0:rsidRPr="003750D9" ns0:rsidRDefault="003750D9" ns0:rsidP="003750D9">
@@ -4243,80 +4167,8 @@
           <ns0:szCs ns0:val="22"/>
         </ns0:rPr>
       </ns0:pPr>
-      <ns0:r ns0:rsidRPr="003750D9">
-        <ns0:rPr>
-          <ns0:rFonts ns0:asciiTheme="minorHAnsi" ns0:hAnsiTheme="minorHAnsi" ns0:cstheme="minorHAnsi"/>
-          <ns0:b/>
-          <ns0:bCs/>
-          <ns0:color ns0:val="000000" ns0:themeColor="text1"/>
-          <ns0:sz ns0:val="22"/>
-          <ns0:szCs ns0:val="22"/>
-        </ns0:rPr>
-        <ns0:t>Sistema de Plantillas:</ns0:t>
-      </ns0:r>
-      <ns0:r ns0:rsidRPr="003750D9">
-        <ns0:rPr>
-          <ns0:rFonts ns0:asciiTheme="minorHAnsi" ns0:hAnsiTheme="minorHAnsi" ns0:cstheme="minorHAnsi"/>
-          <ns0:color ns0:val="000000" ns0:themeColor="text1"/>
-          <ns0:sz ns0:val="22"/>
-          <ns0:szCs ns0:val="22"/>
-        </ns0:rPr>
-        <ns0:t xml:space="preserve"> Al igual que </ns0:t>
-      </ns0:r>
-      <ns0:r ns0:rsidR="00DD05D0">
-        <ns0:rPr>
-          <ns0:rFonts ns0:asciiTheme="minorHAnsi" ns0:hAnsiTheme="minorHAnsi" ns0:cstheme="minorHAnsi"/>
-          <ns0:color ns0:val="000000" ns0:themeColor="text1"/>
-          <ns0:sz ns0:val="22"/>
-          <ns0:szCs ns0:val="22"/>
-        </ns0:rPr>
-        <ns0:t>la</ns0:t>
-      </ns0:r>
-      <ns0:r ns0:rsidRPr="003750D9">
-        <ns0:rPr>
-          <ns0:rFonts ns0:asciiTheme="minorHAnsi" ns0:hAnsiTheme="minorHAnsi" ns0:cstheme="minorHAnsi"/>
-          <ns0:color ns0:val="000000" ns0:themeColor="text1"/>
-          <ns0:sz ns0:val="22"/>
-          <ns0:szCs ns0:val="22"/>
-        </ns0:rPr>
-        <ns0:t xml:space="preserve"> estructura previa (</ns0:t>
-      </ns0:r>
-      <ns0:r ns0:rsidRPr="003750D9">
-        <ns0:rPr>
-          <ns0:rStyle ns0:val="CdigoHTML"/>
-          <ns0:rFonts ns0:asciiTheme="minorHAnsi" ns0:hAnsiTheme="minorHAnsi" ns0:cstheme="minorHAnsi"/>
-          <ns0:color ns0:val="000000" ns0:themeColor="text1"/>
-          <ns0:sz ns0:val="22"/>
-          <ns0:szCs ns0:val="22"/>
-        </ns0:rPr>
-        <ns0:t>mainapp/templates/layouts/layout.html</ns0:t>
-      </ns0:r>
-      <ns0:r ns0:rsidRPr="003750D9">
-        <ns0:rPr>
-          <ns0:rFonts ns0:asciiTheme="minorHAnsi" ns0:hAnsiTheme="minorHAnsi" ns0:cstheme="minorHAnsi"/>
-          <ns0:color ns0:val="000000" ns0:themeColor="text1"/>
-          <ns0:sz ns0:val="22"/>
-          <ns0:szCs ns0:val="22"/>
-        </ns0:rPr>
-        <ns0:t>), diseña</ns0:t>
-      </ns0:r>
-      <ns0:r ns0:rsidR="00DD05D0">
-        <ns0:rPr>
-          <ns0:rFonts ns0:asciiTheme="minorHAnsi" ns0:hAnsiTheme="minorHAnsi" ns0:cstheme="minorHAnsi"/>
-          <ns0:color ns0:val="000000" ns0:themeColor="text1"/>
-          <ns0:sz ns0:val="22"/>
-          <ns0:szCs ns0:val="22"/>
-        </ns0:rPr>
-        <ns0:t>r</ns0:t>
-      </ns0:r>
-      <ns0:r ns0:rsidRPr="003750D9">
-        <ns0:rPr>
-          <ns0:rFonts ns0:asciiTheme="minorHAnsi" ns0:hAnsiTheme="minorHAnsi" ns0:cstheme="minorHAnsi"/>
-          <ns0:color ns0:val="000000" ns0:themeColor="text1"/>
-          <ns0:sz ns0:val="22"/>
-          <ns0:szCs ns0:val="22"/>
-        </ns0:rPr>
-        <ns0:t xml:space="preserve"> una plantilla base con barra de navegación adaptada al rol, aplicando estilos modernos (puedes apoyarte en Bootstrap o Tailwind tal como usa el prototipo). </ns0:t>
+      <ns0:r>
+        <ns0:t>Sistema de plantillas: ya existe una plantilla base en mainapp/templates/layouts/layout.html, con navegación para las secciones del sitio y opciones de acceso. Para el sistema GYM se debe ampliar y adaptar esa navegación según los roles y permisos que se implementen.</ns0:t>
       </ns0:r>
     </ns0:p>
     <ns0:p ns2:paraId="2E3308F6" ns2:textId="6E5E49F4" ns0:rsidR="003750D9" ns0:rsidRPr="003750D9" ns0:rsidRDefault="003750D9" ns0:rsidP="003750D9">
@@ -4334,62 +4186,8 @@
           <ns0:szCs ns0:val="22"/>
         </ns0:rPr>
       </ns0:pPr>
-      <ns0:r ns0:rsidRPr="003750D9">
-        <ns0:rPr>
-          <ns0:rFonts ns0:asciiTheme="minorHAnsi" ns0:hAnsiTheme="minorHAnsi" ns0:cstheme="minorHAnsi"/>
-          <ns0:b/>
-          <ns0:bCs/>
-          <ns0:color ns0:val="000000" ns0:themeColor="text1"/>
-          <ns0:sz ns0:val="22"/>
-          <ns0:szCs ns0:val="22"/>
-        </ns0:rPr>
-        <ns0:t>Módulo de Rutinas y Progreso:</ns0:t>
-      </ns0:r>
-      <ns0:r ns0:rsidRPr="003750D9">
-        <ns0:rPr>
-          <ns0:rFonts ns0:asciiTheme="minorHAnsi" ns0:hAnsiTheme="minorHAnsi" ns0:cstheme="minorHAnsi"/>
-          <ns0:color ns0:val="000000" ns0:themeColor="text1"/>
-          <ns0:sz ns0:val="22"/>
-          <ns0:szCs ns0:val="22"/>
-        </ns0:rPr>
-        <ns0:t xml:space="preserve"> Crea</ns0:t>
-      </ns0:r>
-      <ns0:r ns0:rsidR="00DD05D0">
-        <ns0:rPr>
-          <ns0:rFonts ns0:asciiTheme="minorHAnsi" ns0:hAnsiTheme="minorHAnsi" ns0:cstheme="minorHAnsi"/>
-          <ns0:color ns0:val="000000" ns0:themeColor="text1"/>
-          <ns0:sz ns0:val="22"/>
-          <ns0:szCs ns0:val="22"/>
-        </ns0:rPr>
-        <ns0:t>r los</ns0:t>
-      </ns0:r>
-      <ns0:r ns0:rsidRPr="003750D9">
-        <ns0:rPr>
-          <ns0:rFonts ns0:asciiTheme="minorHAnsi" ns0:hAnsiTheme="minorHAnsi" ns0:cstheme="minorHAnsi"/>
-          <ns0:color ns0:val="000000" ns0:themeColor="text1"/>
-          <ns0:sz ns0:val="22"/>
-          <ns0:szCs ns0:val="22"/>
-        </ns0:rPr>
-        <ns0:t xml:space="preserve"> formularios en Django (</ns0:t>
-      </ns0:r>
-      <ns0:r ns0:rsidRPr="003750D9">
-        <ns0:rPr>
-          <ns0:rStyle ns0:val="CdigoHTML"/>
-          <ns0:rFonts ns0:asciiTheme="minorHAnsi" ns0:hAnsiTheme="minorHAnsi" ns0:cstheme="minorHAnsi"/>
-          <ns0:color ns0:val="000000" ns0:themeColor="text1"/>
-          <ns0:sz ns0:val="22"/>
-          <ns0:szCs ns0:val="22"/>
-        </ns0:rPr>
-        <ns0:t>forms.py</ns0:t>
-      </ns0:r>
-      <ns0:r ns0:rsidRPr="003750D9">
-        <ns0:rPr>
-          <ns0:rFonts ns0:asciiTheme="minorHAnsi" ns0:hAnsiTheme="minorHAnsi" ns0:cstheme="minorHAnsi"/>
-          <ns0:color ns0:val="000000" ns0:themeColor="text1"/>
-          <ns0:sz ns0:val="22"/>
-          <ns0:szCs ns0:val="22"/>
-        </ns0:rPr>
-        <ns0:t>) para que los instructores puedan registrar los avances corporales de los aprendices y graficar su evolución (peso, IMC).</ns0:t>
+      <ns0:r>
+        <ns0:t>Módulo de rutinas y progreso: sigue pendiente crear los formularios para que los instructores registren los avances corporales de los aprendices y consultar su evolución (peso, IMC).</ns0:t>
       </ns0:r>
     </ns0:p>
     <ns0:p ns2:paraId="196966C2" ns2:textId="77777777" ns0:rsidR="003750D9" ns0:rsidRPr="003750D9" ns0:rsidRDefault="003750D9" ns0:rsidP="003750D9">
@@ -4428,7 +4226,7 @@
         <ns0:pStyle ns0:val="NormalWeb"/>
       </ns0:pPr>
       <ns0:r>
-        <ns0:t>ProyectoDjango: contiene las aplicaciones mainapp, blog y pages. mainapp ofrece las páginas de inicio y sobre nosotros; blog gestiona artículos y categorías; pages permite publicar páginas con URL amigable. El contenido se administra en Django Admin, se usa SQLite y CKEditor, y los artículos se relacionan con el usuario integrado de Django.</ns0:t>
+        <ns0:t>ProyectoDjango: contiene las aplicaciones mainapp, blog y pages. mainapp ofrece inicio, sobre nosotros y las pantallas de registro e inicio de sesión; blog gestiona artículos y categorías; pages permite publicar páginas con URL amigable. El contenido se administra en Django Admin, se usa SQLite y CKEditor, y los artículos se relacionan con el usuario integrado de Django.</ns0:t>
       </ns0:r>
     </ns0:p>
     <ns0:p>
@@ -4441,10 +4239,42 @@
     </ns0:p>
     <ns0:p>
       <ns0:pPr>
+        <ns0:pStyle ns0:val="Ttulo4"/>
+      </ns0:pPr>
+      <ns0:r>
+        <ns0:t>Avances implementados en ProyectoDjango</ns0:t>
+      </ns0:r>
+    </ns0:p>
+    <ns0:p>
+      <ns0:pPr>
         <ns0:pStyle ns0:val="NormalWeb"/>
       </ns0:pPr>
       <ns0:r>
-        <ns0:t>Conclusión: el código encontrado sirve como base de aprendizaje y de administración de contenido, pero no corresponde todavía a la aplicación GYM descrita en esta guía.</ns0:t>
+        <ns0:t>Autenticación: se añadió un formulario basado en UserCreationForm para registrar usuarios estándar de Django con nombre de usuario, correo, nombres y apellidos. Las vistas permiten iniciar sesión y cerrar sesión; muestran mensajes de confirmación o error y redirigen al usuario según el resultado.</ns0:t>
+      </ns0:r>
+    </ns0:p>
+    <ns0:p>
+      <ns0:pPr>
+        <ns0:pStyle ns0:val="NormalWeb"/>
+      </ns0:pPr>
+      <ns0:r>
+        <ns0:t>Acceso y navegación: se requiere iniciar sesión para consultar el listado de artículos, sus categorías, el detalle de un artículo y las páginas dinámicas. El listado de artículos usa paginación de dos elementos por página. La página de inicio muestra información de bienvenida y el menú ofrece opciones de acceso o cierre de sesión.</ns0:t>
+      </ns0:r>
+    </ns0:p>
+    <ns0:p>
+      <ns0:pPr>
+        <ns0:pStyle ns0:val="NormalWeb"/>
+      </ns0:pPr>
+      <ns0:r>
+        <ns0:t>Alcance: estas funciones usan la autenticación estándar de Django; todavía no existen cuentas con perfiles de aprendiz o instructor ni permisos propios del gimnasio.</ns0:t>
+      </ns0:r>
+    </ns0:p>
+    <ns0:p>
+      <ns0:pPr>
+        <ns0:pStyle ns0:val="NormalWeb"/>
+      </ns0:pPr>
+      <ns0:r>
+        <ns0:t>Conclusión: el proyecto sigue siendo una aplicación de aprendizaje y administración de contenido, no el sistema GYM descrito en esta guía. La autenticación básica y la restricción de acceso son avances reutilizables, pero no sustituyen los modelos, roles ni funcionalidades propias del gimnasio.</ns0:t>
       </ns0:r>
     </ns0:p>
     <ns0:p>
@@ -4460,7 +4290,7 @@
         <ns0:pStyle ns0:val="NormalWeb"/>
       </ns0:pPr>
       <ns0:r>
-        <ns0:t>Modelos y datos: no están implementados usuarios del gimnasio, centros, dependencias, programas, fichas, instructores, aprendices, ejercicios, músculos, máquinas, rutinas, asignaciones ni registros de progreso físico.</ns0:t>
+        <ns0:t>Modelos y datos: no están implementados los modelos propios del gimnasio para usuarios y sus perfiles (aprendices, instructores y funcionarios), centros, dependencias, programas, fichas, ejercicios, músculos, máquinas, rutinas, asignaciones ni registros de progreso físico. El proyecto usa por ahora el modelo User estándar de Django.</ns0:t>
       </ns0:r>
     </ns0:p>
     <ns0:p>
@@ -4468,7 +4298,7 @@
         <ns0:pStyle ns0:val="NormalWeb"/>
       </ns0:pPr>
       <ns0:r>
-        <ns0:t>Aplicaciones y permisos: no existen las apps usuarios, centros, rutinas y seguimiento descritas en la Fase 1. Aunque ProyectoDjango tiene habilitada la autenticación estándar de Django y vincula los artículos con un usuario, todavía no define roles ni permisos diferenciados de aprendiz, instructor y administrador.</ns0:t>
+        <ns0:t>Aplicaciones y permisos: no existen las apps usuarios, centros, rutinas y seguimiento descritas en la Fase 1. Ya se puede registrar, iniciar y cerrar sesión; además, las vistas de artículos, categorías y páginas requieren autenticación. Todavía no hay roles ni permisos diferenciados de aprendiz, instructor y administrador.</ns0:t>
       </ns0:r>
     </ns0:p>
     <ns0:p>
@@ -4476,7 +4306,7 @@
         <ns0:pStyle ns0:val="NormalWeb"/>
       </ns0:pPr>
       <ns0:r>
-        <ns0:t>Funciones y pantallas: faltan formularios, vistas y plantillas para asignar rutinas, registrar medidas, consultar avances y administrar las entidades del gimnasio.</ns0:t>
+        <ns0:t>Funciones y pantallas: ya existen formularios y plantillas para registro e inicio de sesión, mensajes de resultado y navegación condicionada por la sesión. Faltan los formularios, vistas y plantillas para asignar rutinas, registrar medidas, consultar avances y administrar las entidades del gimnasio.</ns0:t>
       </ns0:r>
     </ns0:p>
     <ns0:p>
@@ -4484,7 +4314,7 @@
         <ns0:pStyle ns0:val="NormalWeb"/>
       </ns0:pPr>
       <ns0:r>
-        <ns0:t>Pruebas y correcciones: los archivos tests.py de blog y pages no contienen pruebas. Además, blog.views.list invoca render(render, ...), en lugar de render(request, ...); la vista del listado de artículos debe corregirse y probarse antes de considerarla funcional.</ns0:t>
+        <ns0:t>Pruebas y correcciones: los archivos tests.py de mainapp, blog y pages solo contienen la plantilla inicial de Django, sin pruebas funcionales. La vista blog.views.list ya usa render(request, ...) y la lista de artículos está protegida para usuarios autenticados; queda pendiente añadir y ejecutar pruebas para el registro, el inicio y cierre de sesión y el acceso restringido.</ns0:t>
       </ns0:r>
     </ns0:p>
     <ns0:p>
@@ -4524,7 +4354,7 @@
         <ns0:pStyle ns0:val="NormalWeb"/>
       </ns0:pPr>
       <ns0:r>
-        <ns0:t>4. Añadir formularios, vistas, plantillas y permisos por rol para la gestión de usuarios, rutinas, asignaciones y seguimiento.</ns0:t>
+        <ns0:t>4. Completar formularios, vistas y plantillas del gimnasio; definir roles y permisos para gestionar usuarios, rutinas, asignaciones y seguimiento.</ns0:t>
       </ns0:r>
     </ns0:p>
     <ns0:p>
@@ -4532,7 +4362,7 @@
         <ns0:pStyle ns0:val="NormalWeb"/>
       </ns0:pPr>
       <ns0:r>
-        <ns0:t>5. Corregir la vista del listado de artículos ya existente y añadir pruebas para las funciones del sitio y los nuevos flujos del gimnasio.</ns0:t>
+        <ns0:t>5. Añadir pruebas para el registro, el inicio y cierre de sesión, las vistas protegidas y las funcionalidades nuevas del gimnasio.</ns0:t>
       </ns0:r>
     </ns0:p>
     <ns0:p>
@@ -4540,7 +4370,7 @@
         <ns0:pStyle ns0:val="NormalWeb"/>
       </ns0:pPr>
       <ns0:r>
-        <ns0:t>Esta comparación documenta el estado observado del código; las funciones descritas en las fases anteriores siguen siendo trabajo pendiente hasta que se implementen y validen.</ns0:t>
+        <ns0:t>Esta comparación documenta el estado observado del código. La autenticación básica y las vistas protegidas ya están implementadas; las funcionalidades específicas del sistema GYM siguen pendientes hasta que se desarrollen y validen.</ns0:t>
       </ns0:r>
     </ns0:p>
     <ns0:sectPr ns0:rsidR="003750D9" ns0:rsidRPr="003750D9">

</xml_diff>